<commit_message>
Update Task 2 Development Template x.docx
</commit_message>
<xml_diff>
--- a/Docs/Task 2 Development Template x.docx
+++ b/Docs/Task 2 Development Template x.docx
@@ -34,7 +34,7 @@
         <w:spacing w:after="120"/>
       </w:pPr>
       <w:r>
-        <w:t>I have written this development diary to show how I built my Greenfield Local Hub web application. I have kept it in days so it is clear what I added, what problems I had, and how I fixed them. I changed the diary into 8 days because some early parts of the project were small and could easily be done together in one day. Where screenshots are needed, I have pasted the code section that I would screenshot instead.</w:t>
+        <w:t>I have written this development diary to show how I built my Greenfield Local Hub web application. I have kept it in days so it is clear what I added, what problems I had, and how I fixed them.</w:t>
       </w:r>
     </w:p>
     <w:p>
@@ -263,7 +263,6 @@
           <w:sz w:val="19"/>
           <w:szCs w:val="19"/>
         </w:rPr>
-        <w:lastRenderedPageBreak/>
         <w:t>&lt;PackageReference Include="Microsoft.VisualStudio.Web.CodeGeneration.Design" Version="9.0.12" /&gt;</w:t>
       </w:r>
     </w:p>
@@ -278,6 +277,7 @@
           <w:sz w:val="26"/>
           <w:szCs w:val="26"/>
         </w:rPr>
+        <w:lastRenderedPageBreak/>
         <w:t>1.2</w:t>
       </w:r>
     </w:p>
@@ -638,55 +638,55 @@
           <w:sz w:val="19"/>
           <w:szCs w:val="19"/>
         </w:rPr>
+        <w:t xml:space="preserve">    public string productImage { get; set; }</w:t>
+      </w:r>
+    </w:p>
+    <w:p>
+      <w:pPr>
+        <w:shd w:val="clear" w:color="auto" w:fill="F2F2F2"/>
+        <w:spacing w:after="0"/>
+      </w:pPr>
+      <w:r>
+        <w:rPr>
+          <w:rFonts w:ascii="Courier New" w:hAnsi="Courier New"/>
+          <w:sz w:val="19"/>
+          <w:szCs w:val="19"/>
+        </w:rPr>
+        <w:t xml:space="preserve">    public string productUnit { get; set; }</w:t>
+      </w:r>
+    </w:p>
+    <w:p>
+      <w:pPr>
+        <w:shd w:val="clear" w:color="auto" w:fill="F2F2F2"/>
+        <w:spacing w:after="0"/>
+      </w:pPr>
+    </w:p>
+    <w:p>
+      <w:pPr>
+        <w:shd w:val="clear" w:color="auto" w:fill="F2F2F2"/>
+        <w:spacing w:after="0"/>
+      </w:pPr>
+      <w:r>
+        <w:rPr>
+          <w:rFonts w:ascii="Courier New" w:hAnsi="Courier New"/>
+          <w:sz w:val="19"/>
+          <w:szCs w:val="19"/>
+        </w:rPr>
+        <w:t xml:space="preserve">    public producers? producers { get; set; }</w:t>
+      </w:r>
+    </w:p>
+    <w:p>
+      <w:pPr>
+        <w:shd w:val="clear" w:color="auto" w:fill="F2F2F2"/>
+        <w:spacing w:after="0"/>
+      </w:pPr>
+      <w:r>
+        <w:rPr>
+          <w:rFonts w:ascii="Courier New" w:hAnsi="Courier New"/>
+          <w:sz w:val="19"/>
+          <w:szCs w:val="19"/>
+        </w:rPr>
         <w:lastRenderedPageBreak/>
-        <w:t xml:space="preserve">    public string productImage { get; set; }</w:t>
-      </w:r>
-    </w:p>
-    <w:p>
-      <w:pPr>
-        <w:shd w:val="clear" w:color="auto" w:fill="F2F2F2"/>
-        <w:spacing w:after="0"/>
-      </w:pPr>
-      <w:r>
-        <w:rPr>
-          <w:rFonts w:ascii="Courier New" w:hAnsi="Courier New"/>
-          <w:sz w:val="19"/>
-          <w:szCs w:val="19"/>
-        </w:rPr>
-        <w:t xml:space="preserve">    public string productUnit { get; set; }</w:t>
-      </w:r>
-    </w:p>
-    <w:p>
-      <w:pPr>
-        <w:shd w:val="clear" w:color="auto" w:fill="F2F2F2"/>
-        <w:spacing w:after="0"/>
-      </w:pPr>
-    </w:p>
-    <w:p>
-      <w:pPr>
-        <w:shd w:val="clear" w:color="auto" w:fill="F2F2F2"/>
-        <w:spacing w:after="0"/>
-      </w:pPr>
-      <w:r>
-        <w:rPr>
-          <w:rFonts w:ascii="Courier New" w:hAnsi="Courier New"/>
-          <w:sz w:val="19"/>
-          <w:szCs w:val="19"/>
-        </w:rPr>
-        <w:t xml:space="preserve">    public producers? producers { get; set; }</w:t>
-      </w:r>
-    </w:p>
-    <w:p>
-      <w:pPr>
-        <w:shd w:val="clear" w:color="auto" w:fill="F2F2F2"/>
-        <w:spacing w:after="0"/>
-      </w:pPr>
-      <w:r>
-        <w:rPr>
-          <w:rFonts w:ascii="Courier New" w:hAnsi="Courier New"/>
-          <w:sz w:val="19"/>
-          <w:szCs w:val="19"/>
-        </w:rPr>
         <w:t xml:space="preserve">    public categories categories { get; set; }</w:t>
       </w:r>
     </w:p>
@@ -1147,55 +1147,55 @@
           <w:sz w:val="19"/>
           <w:szCs w:val="19"/>
         </w:rPr>
+        <w:t>Add-Migration productUnit</w:t>
+      </w:r>
+    </w:p>
+    <w:p>
+      <w:pPr>
+        <w:shd w:val="clear" w:color="auto" w:fill="F2F2F2"/>
+        <w:spacing w:after="0"/>
+      </w:pPr>
+      <w:r>
+        <w:rPr>
+          <w:rFonts w:ascii="Courier New" w:hAnsi="Courier New"/>
+          <w:sz w:val="19"/>
+          <w:szCs w:val="19"/>
+        </w:rPr>
+        <w:t>Update-Database</w:t>
+      </w:r>
+    </w:p>
+    <w:p>
+      <w:pPr>
+        <w:shd w:val="clear" w:color="auto" w:fill="F2F2F2"/>
+        <w:spacing w:after="0"/>
+      </w:pPr>
+    </w:p>
+    <w:p>
+      <w:pPr>
+        <w:shd w:val="clear" w:color="auto" w:fill="F2F2F2"/>
+        <w:spacing w:after="0"/>
+      </w:pPr>
+      <w:r>
+        <w:rPr>
+          <w:rFonts w:ascii="Courier New" w:hAnsi="Courier New"/>
+          <w:sz w:val="19"/>
+          <w:szCs w:val="19"/>
+        </w:rPr>
+        <w:t>Add-Migration AddPendingOfferToLoyaltyAccount</w:t>
+      </w:r>
+    </w:p>
+    <w:p>
+      <w:pPr>
+        <w:shd w:val="clear" w:color="auto" w:fill="F2F2F2"/>
+        <w:spacing w:after="0"/>
+      </w:pPr>
+      <w:r>
+        <w:rPr>
+          <w:rFonts w:ascii="Courier New" w:hAnsi="Courier New"/>
+          <w:sz w:val="19"/>
+          <w:szCs w:val="19"/>
+        </w:rPr>
         <w:lastRenderedPageBreak/>
-        <w:t>Add-Migration productUnit</w:t>
-      </w:r>
-    </w:p>
-    <w:p>
-      <w:pPr>
-        <w:shd w:val="clear" w:color="auto" w:fill="F2F2F2"/>
-        <w:spacing w:after="0"/>
-      </w:pPr>
-      <w:r>
-        <w:rPr>
-          <w:rFonts w:ascii="Courier New" w:hAnsi="Courier New"/>
-          <w:sz w:val="19"/>
-          <w:szCs w:val="19"/>
-        </w:rPr>
-        <w:t>Update-Database</w:t>
-      </w:r>
-    </w:p>
-    <w:p>
-      <w:pPr>
-        <w:shd w:val="clear" w:color="auto" w:fill="F2F2F2"/>
-        <w:spacing w:after="0"/>
-      </w:pPr>
-    </w:p>
-    <w:p>
-      <w:pPr>
-        <w:shd w:val="clear" w:color="auto" w:fill="F2F2F2"/>
-        <w:spacing w:after="0"/>
-      </w:pPr>
-      <w:r>
-        <w:rPr>
-          <w:rFonts w:ascii="Courier New" w:hAnsi="Courier New"/>
-          <w:sz w:val="19"/>
-          <w:szCs w:val="19"/>
-        </w:rPr>
-        <w:t>Add-Migration AddPendingOfferToLoyaltyAccount</w:t>
-      </w:r>
-    </w:p>
-    <w:p>
-      <w:pPr>
-        <w:shd w:val="clear" w:color="auto" w:fill="F2F2F2"/>
-        <w:spacing w:after="0"/>
-      </w:pPr>
-      <w:r>
-        <w:rPr>
-          <w:rFonts w:ascii="Courier New" w:hAnsi="Courier New"/>
-          <w:sz w:val="19"/>
-          <w:szCs w:val="19"/>
-        </w:rPr>
         <w:t>Update-Database</w:t>
       </w:r>
     </w:p>
@@ -1632,31 +1632,31 @@
         <w:spacing w:after="120"/>
       </w:pPr>
       <w:r>
+        <w:t>- Created the ASP.NET Core MVC project</w:t>
+      </w:r>
+    </w:p>
+    <w:p>
+      <w:pPr>
+        <w:spacing w:after="120"/>
+      </w:pPr>
+      <w:r>
+        <w:t>- Used C# and .NET 9.0</w:t>
+      </w:r>
+    </w:p>
+    <w:p>
+      <w:pPr>
+        <w:spacing w:after="120"/>
+      </w:pPr>
+      <w:r>
+        <w:t>- Selected Individual Accounts</w:t>
+      </w:r>
+    </w:p>
+    <w:p>
+      <w:pPr>
+        <w:spacing w:after="120"/>
+      </w:pPr>
+      <w:r>
         <w:lastRenderedPageBreak/>
-        <w:t>- Created the ASP.NET Core MVC project</w:t>
-      </w:r>
-    </w:p>
-    <w:p>
-      <w:pPr>
-        <w:spacing w:after="120"/>
-      </w:pPr>
-      <w:r>
-        <w:t>- Used C# and .NET 9.0</w:t>
-      </w:r>
-    </w:p>
-    <w:p>
-      <w:pPr>
-        <w:spacing w:after="120"/>
-      </w:pPr>
-      <w:r>
-        <w:t>- Selected Individual Accounts</w:t>
-      </w:r>
-    </w:p>
-    <w:p>
-      <w:pPr>
-        <w:spacing w:after="120"/>
-      </w:pPr>
-      <w:r>
         <w:t>- Checked the folder structure</w:t>
       </w:r>
     </w:p>
@@ -1966,7 +1966,6 @@
           <w:sz w:val="19"/>
           <w:szCs w:val="19"/>
         </w:rPr>
-        <w:lastRenderedPageBreak/>
         <w:t xml:space="preserve">        .ToListAsync();</w:t>
       </w:r>
     </w:p>
@@ -2015,6 +2014,7 @@
           <w:sz w:val="26"/>
           <w:szCs w:val="26"/>
         </w:rPr>
+        <w:lastRenderedPageBreak/>
         <w:t>2.2</w:t>
       </w:r>
     </w:p>
@@ -2427,15 +2427,15 @@
           <w:sz w:val="26"/>
           <w:szCs w:val="26"/>
         </w:rPr>
+        <w:t>2.3</w:t>
+      </w:r>
+    </w:p>
+    <w:p>
+      <w:pPr>
+        <w:spacing w:after="120"/>
+      </w:pPr>
+      <w:r>
         <w:lastRenderedPageBreak/>
-        <w:t>2.3</w:t>
-      </w:r>
-    </w:p>
-    <w:p>
-      <w:pPr>
-        <w:spacing w:after="120"/>
-      </w:pPr>
-      <w:r>
         <w:t>I then created roles for Admin, Producer, User and Developer. I did this because different people should have different access. Customers should shop, producers should manage their own products and orders, and admin/developer accounts should help with management and testing.</w:t>
       </w:r>
     </w:p>
@@ -2940,35 +2940,35 @@
           <w:sz w:val="19"/>
           <w:szCs w:val="19"/>
         </w:rPr>
+        <w:t xml:space="preserve">    .FirstOrDefaultAsync(c =&gt; c.categoryName == "Meat &amp; Poultry");</w:t>
+      </w:r>
+    </w:p>
+    <w:p>
+      <w:pPr>
+        <w:shd w:val="clear" w:color="auto" w:fill="F2F2F2"/>
+        <w:spacing w:after="0"/>
+      </w:pPr>
+      <w:r>
+        <w:rPr>
+          <w:rFonts w:ascii="Courier New" w:hAnsi="Courier New"/>
+          <w:sz w:val="19"/>
+          <w:szCs w:val="19"/>
+        </w:rPr>
+        <w:t>var honeyCat = await context.categories</w:t>
+      </w:r>
+    </w:p>
+    <w:p>
+      <w:pPr>
+        <w:shd w:val="clear" w:color="auto" w:fill="F2F2F2"/>
+        <w:spacing w:after="0"/>
+      </w:pPr>
+      <w:r>
+        <w:rPr>
+          <w:rFonts w:ascii="Courier New" w:hAnsi="Courier New"/>
+          <w:sz w:val="19"/>
+          <w:szCs w:val="19"/>
+        </w:rPr>
         <w:lastRenderedPageBreak/>
-        <w:t xml:space="preserve">    .FirstOrDefaultAsync(c =&gt; c.categoryName == "Meat &amp; Poultry");</w:t>
-      </w:r>
-    </w:p>
-    <w:p>
-      <w:pPr>
-        <w:shd w:val="clear" w:color="auto" w:fill="F2F2F2"/>
-        <w:spacing w:after="0"/>
-      </w:pPr>
-      <w:r>
-        <w:rPr>
-          <w:rFonts w:ascii="Courier New" w:hAnsi="Courier New"/>
-          <w:sz w:val="19"/>
-          <w:szCs w:val="19"/>
-        </w:rPr>
-        <w:t>var honeyCat = await context.categories</w:t>
-      </w:r>
-    </w:p>
-    <w:p>
-      <w:pPr>
-        <w:shd w:val="clear" w:color="auto" w:fill="F2F2F2"/>
-        <w:spacing w:after="0"/>
-      </w:pPr>
-      <w:r>
-        <w:rPr>
-          <w:rFonts w:ascii="Courier New" w:hAnsi="Courier New"/>
-          <w:sz w:val="19"/>
-          <w:szCs w:val="19"/>
-        </w:rPr>
         <w:t xml:space="preserve">    .FirstOrDefaultAsync(c =&gt; c.categoryName == "Honey &amp; Preserves");</w:t>
       </w:r>
     </w:p>
@@ -3377,7 +3377,6 @@
           <w:sz w:val="30"/>
           <w:szCs w:val="30"/>
         </w:rPr>
-        <w:lastRenderedPageBreak/>
         <w:t>Day 3 - Shop page, search, filters, sorting and pagination</w:t>
       </w:r>
     </w:p>
@@ -3391,6 +3390,7 @@
           <w:sz w:val="26"/>
           <w:szCs w:val="26"/>
         </w:rPr>
+        <w:lastRenderedPageBreak/>
         <w:t>3.1</w:t>
       </w:r>
     </w:p>
@@ -3801,35 +3801,35 @@
           <w:sz w:val="19"/>
           <w:szCs w:val="19"/>
         </w:rPr>
+        <w:t>ViewBag.CurrentCategoryId = categoryId;</w:t>
+      </w:r>
+    </w:p>
+    <w:p>
+      <w:pPr>
+        <w:shd w:val="clear" w:color="auto" w:fill="F2F2F2"/>
+        <w:spacing w:after="0"/>
+      </w:pPr>
+      <w:r>
+        <w:rPr>
+          <w:rFonts w:ascii="Courier New" w:hAnsi="Courier New"/>
+          <w:sz w:val="19"/>
+          <w:szCs w:val="19"/>
+        </w:rPr>
+        <w:t>ViewBag.CurrentStockFilter = stockFilter;</w:t>
+      </w:r>
+    </w:p>
+    <w:p>
+      <w:pPr>
+        <w:shd w:val="clear" w:color="auto" w:fill="F2F2F2"/>
+        <w:spacing w:after="0"/>
+      </w:pPr>
+      <w:r>
+        <w:rPr>
+          <w:rFonts w:ascii="Courier New" w:hAnsi="Courier New"/>
+          <w:sz w:val="19"/>
+          <w:szCs w:val="19"/>
+        </w:rPr>
         <w:lastRenderedPageBreak/>
-        <w:t>ViewBag.CurrentCategoryId = categoryId;</w:t>
-      </w:r>
-    </w:p>
-    <w:p>
-      <w:pPr>
-        <w:shd w:val="clear" w:color="auto" w:fill="F2F2F2"/>
-        <w:spacing w:after="0"/>
-      </w:pPr>
-      <w:r>
-        <w:rPr>
-          <w:rFonts w:ascii="Courier New" w:hAnsi="Courier New"/>
-          <w:sz w:val="19"/>
-          <w:szCs w:val="19"/>
-        </w:rPr>
-        <w:t>ViewBag.CurrentStockFilter = stockFilter;</w:t>
-      </w:r>
-    </w:p>
-    <w:p>
-      <w:pPr>
-        <w:shd w:val="clear" w:color="auto" w:fill="F2F2F2"/>
-        <w:spacing w:after="0"/>
-      </w:pPr>
-      <w:r>
-        <w:rPr>
-          <w:rFonts w:ascii="Courier New" w:hAnsi="Courier New"/>
-          <w:sz w:val="19"/>
-          <w:szCs w:val="19"/>
-        </w:rPr>
         <w:t>ViewBag.CurrentSort = sortBy;</w:t>
       </w:r>
     </w:p>
@@ -4308,29 +4308,29 @@
           <w:sz w:val="19"/>
           <w:szCs w:val="19"/>
         </w:rPr>
+        <w:t>ViewBag.PageSize = pageSize;</w:t>
+      </w:r>
+    </w:p>
+    <w:p>
+      <w:pPr>
+        <w:shd w:val="clear" w:color="auto" w:fill="F2F2F2"/>
+        <w:spacing w:after="0"/>
+      </w:pPr>
+      <w:r>
+        <w:rPr>
+          <w:rFonts w:ascii="Courier New" w:hAnsi="Courier New"/>
+          <w:sz w:val="19"/>
+          <w:szCs w:val="19"/>
+        </w:rPr>
+        <w:t>ViewBag.TotalPages = (int)Math.Ceiling(totalItems / (double)pageSize);</w:t>
+      </w:r>
+    </w:p>
+    <w:p>
+      <w:pPr>
+        <w:spacing w:after="120"/>
+      </w:pPr>
+      <w:r>
         <w:lastRenderedPageBreak/>
-        <w:t>ViewBag.PageSize = pageSize;</w:t>
-      </w:r>
-    </w:p>
-    <w:p>
-      <w:pPr>
-        <w:shd w:val="clear" w:color="auto" w:fill="F2F2F2"/>
-        <w:spacing w:after="0"/>
-      </w:pPr>
-      <w:r>
-        <w:rPr>
-          <w:rFonts w:ascii="Courier New" w:hAnsi="Courier New"/>
-          <w:sz w:val="19"/>
-          <w:szCs w:val="19"/>
-        </w:rPr>
-        <w:t>ViewBag.TotalPages = (int)Math.Ceiling(totalItems / (double)pageSize);</w:t>
-      </w:r>
-    </w:p>
-    <w:p>
-      <w:pPr>
-        <w:spacing w:after="120"/>
-      </w:pPr>
-      <w:r>
         <w:t>I also made the shop behave differently for producer accounts. If the user is a producer, the products page only shows products that belong to that producer. This is important because producers should not manage or see another producer's product management list.</w:t>
       </w:r>
     </w:p>

</xml_diff>